<commit_message>
docs: refine dependency security report
</commit_message>
<xml_diff>
--- a/docs/reports/informe-seguridad-dependencias-metra-2026-10-08.docx
+++ b/docs/reports/informe-seguridad-dependencias-metra-2026-10-08.docx
@@ -5,7 +5,7 @@
     <w:p>
       <w:pPr>
         <w:pStyle w:val="Title"/>
-        <w:spacing w:after="60"/>
+        <w:spacing w:after="60" w:line="480" w:lineRule="auto"/>
       </w:pPr>
       <w:r>
         <w:rPr>
@@ -21,7 +21,7 @@
     <w:p>
       <w:pPr>
         <w:pStyle w:val="Subtitle"/>
-        <w:spacing w:after="220"/>
+        <w:spacing w:after="220" w:line="480" w:lineRule="auto"/>
       </w:pPr>
       <w:r>
         <w:rPr>
@@ -36,7 +36,7 @@
     </w:p>
     <w:p>
       <w:pPr>
-        <w:spacing w:before="0" w:after="140" w:line="269" w:lineRule="auto"/>
+        <w:spacing w:before="0" w:after="140" w:line="480" w:lineRule="auto"/>
       </w:pPr>
       <w:r>
         <w:rPr>
@@ -53,7 +53,7 @@
       <w:pPr>
         <w:pStyle w:val="Heading1"/>
         <w:keepNext/>
-        <w:spacing w:before="200" w:after="80"/>
+        <w:spacing w:before="200" w:after="80" w:line="480" w:lineRule="auto"/>
       </w:pPr>
       <w:r>
         <w:rPr>
@@ -68,7 +68,7 @@
     </w:p>
     <w:p>
       <w:pPr>
-        <w:spacing w:before="0" w:after="100" w:line="269" w:lineRule="auto"/>
+        <w:spacing w:before="0" w:after="100" w:line="480" w:lineRule="auto"/>
       </w:pPr>
       <w:r>
         <w:rPr>
@@ -119,7 +119,7 @@
           </w:tcPr>
           <w:p>
             <w:pPr>
-              <w:spacing w:after="0" w:line="252" w:lineRule="auto"/>
+              <w:spacing w:after="0" w:line="480" w:lineRule="auto"/>
             </w:pPr>
             <w:r/>
             <w:r>
@@ -147,7 +147,7 @@
           </w:tcPr>
           <w:p>
             <w:pPr>
-              <w:spacing w:after="0" w:line="252" w:lineRule="auto"/>
+              <w:spacing w:after="0" w:line="480" w:lineRule="auto"/>
             </w:pPr>
             <w:r/>
             <w:r>
@@ -175,7 +175,7 @@
           </w:tcPr>
           <w:p>
             <w:pPr>
-              <w:spacing w:after="0" w:line="252" w:lineRule="auto"/>
+              <w:spacing w:after="0" w:line="480" w:lineRule="auto"/>
             </w:pPr>
             <w:r/>
             <w:r>
@@ -205,7 +205,7 @@
           </w:tcPr>
           <w:p>
             <w:pPr>
-              <w:spacing w:after="0" w:line="252" w:lineRule="auto"/>
+              <w:spacing w:after="0" w:line="480" w:lineRule="auto"/>
             </w:pPr>
             <w:r/>
             <w:r>
@@ -233,7 +233,7 @@
           </w:tcPr>
           <w:p>
             <w:pPr>
-              <w:spacing w:after="0" w:line="252" w:lineRule="auto"/>
+              <w:spacing w:after="0" w:line="480" w:lineRule="auto"/>
             </w:pPr>
             <w:r/>
             <w:r>
@@ -261,7 +261,7 @@
           </w:tcPr>
           <w:p>
             <w:pPr>
-              <w:spacing w:after="0" w:line="252" w:lineRule="auto"/>
+              <w:spacing w:after="0" w:line="480" w:lineRule="auto"/>
             </w:pPr>
             <w:r/>
             <w:r>
@@ -291,7 +291,7 @@
           </w:tcPr>
           <w:p>
             <w:pPr>
-              <w:spacing w:after="0" w:line="252" w:lineRule="auto"/>
+              <w:spacing w:after="0" w:line="480" w:lineRule="auto"/>
             </w:pPr>
             <w:r/>
             <w:r>
@@ -319,7 +319,7 @@
           </w:tcPr>
           <w:p>
             <w:pPr>
-              <w:spacing w:after="0" w:line="252" w:lineRule="auto"/>
+              <w:spacing w:after="0" w:line="480" w:lineRule="auto"/>
             </w:pPr>
             <w:r/>
             <w:r>
@@ -347,7 +347,7 @@
           </w:tcPr>
           <w:p>
             <w:pPr>
-              <w:spacing w:after="0" w:line="252" w:lineRule="auto"/>
+              <w:spacing w:after="0" w:line="480" w:lineRule="auto"/>
             </w:pPr>
             <w:r/>
             <w:r>
@@ -377,7 +377,7 @@
           </w:tcPr>
           <w:p>
             <w:pPr>
-              <w:spacing w:after="0" w:line="252" w:lineRule="auto"/>
+              <w:spacing w:after="0" w:line="480" w:lineRule="auto"/>
             </w:pPr>
             <w:r/>
             <w:r>
@@ -405,7 +405,7 @@
           </w:tcPr>
           <w:p>
             <w:pPr>
-              <w:spacing w:after="0" w:line="252" w:lineRule="auto"/>
+              <w:spacing w:after="0" w:line="480" w:lineRule="auto"/>
             </w:pPr>
             <w:r/>
             <w:r>
@@ -433,7 +433,7 @@
           </w:tcPr>
           <w:p>
             <w:pPr>
-              <w:spacing w:after="0" w:line="252" w:lineRule="auto"/>
+              <w:spacing w:after="0" w:line="480" w:lineRule="auto"/>
             </w:pPr>
             <w:r/>
             <w:r>
@@ -463,7 +463,7 @@
           </w:tcPr>
           <w:p>
             <w:pPr>
-              <w:spacing w:after="0" w:line="252" w:lineRule="auto"/>
+              <w:spacing w:after="0" w:line="480" w:lineRule="auto"/>
             </w:pPr>
             <w:r/>
             <w:r>
@@ -491,7 +491,7 @@
           </w:tcPr>
           <w:p>
             <w:pPr>
-              <w:spacing w:after="0" w:line="252" w:lineRule="auto"/>
+              <w:spacing w:after="0" w:line="480" w:lineRule="auto"/>
             </w:pPr>
             <w:r/>
             <w:r>
@@ -519,7 +519,7 @@
           </w:tcPr>
           <w:p>
             <w:pPr>
-              <w:spacing w:after="0" w:line="252" w:lineRule="auto"/>
+              <w:spacing w:after="0" w:line="480" w:lineRule="auto"/>
             </w:pPr>
             <w:r/>
             <w:r>
@@ -549,7 +549,7 @@
           </w:tcPr>
           <w:p>
             <w:pPr>
-              <w:spacing w:after="0" w:line="252" w:lineRule="auto"/>
+              <w:spacing w:after="0" w:line="480" w:lineRule="auto"/>
             </w:pPr>
             <w:r/>
             <w:r>
@@ -577,7 +577,7 @@
           </w:tcPr>
           <w:p>
             <w:pPr>
-              <w:spacing w:after="0" w:line="252" w:lineRule="auto"/>
+              <w:spacing w:after="0" w:line="480" w:lineRule="auto"/>
             </w:pPr>
             <w:r/>
             <w:r>
@@ -605,7 +605,7 @@
           </w:tcPr>
           <w:p>
             <w:pPr>
-              <w:spacing w:after="0" w:line="252" w:lineRule="auto"/>
+              <w:spacing w:after="0" w:line="480" w:lineRule="auto"/>
             </w:pPr>
             <w:r/>
             <w:r>
@@ -623,12 +623,12 @@
     </w:tbl>
     <w:p>
       <w:pPr>
-        <w:spacing w:after="0"/>
+        <w:spacing w:after="0" w:line="480" w:lineRule="auto"/>
       </w:pPr>
     </w:p>
     <w:p>
       <w:pPr>
-        <w:spacing w:before="0" w:after="100" w:line="269" w:lineRule="auto"/>
+        <w:spacing w:before="0" w:after="100" w:line="480" w:lineRule="auto"/>
       </w:pPr>
       <w:r>
         <w:rPr>
@@ -645,7 +645,7 @@
       <w:pPr>
         <w:pStyle w:val="Heading1"/>
         <w:keepNext/>
-        <w:spacing w:before="200" w:after="80"/>
+        <w:spacing w:before="200" w:after="80" w:line="480" w:lineRule="auto"/>
       </w:pPr>
       <w:r>
         <w:rPr>
@@ -660,7 +660,7 @@
     </w:p>
     <w:p>
       <w:pPr>
-        <w:spacing w:before="0" w:after="100" w:line="269" w:lineRule="auto"/>
+        <w:spacing w:before="0" w:after="100" w:line="480" w:lineRule="auto"/>
       </w:pPr>
       <w:r>
         <w:rPr>
@@ -675,7 +675,7 @@
     </w:p>
     <w:p>
       <w:pPr>
-        <w:spacing w:before="0" w:after="0" w:line="269" w:lineRule="auto"/>
+        <w:spacing w:before="0" w:after="0" w:line="480" w:lineRule="auto"/>
       </w:pPr>
       <w:r>
         <w:rPr>
@@ -692,7 +692,7 @@
       <w:pPr>
         <w:pStyle w:val="Heading1"/>
         <w:keepNext/>
-        <w:spacing w:before="200" w:after="80"/>
+        <w:spacing w:before="200" w:after="80" w:line="480" w:lineRule="auto"/>
       </w:pPr>
       <w:r>
         <w:rPr>
@@ -707,7 +707,7 @@
     </w:p>
     <w:p>
       <w:pPr>
-        <w:spacing w:after="40" w:line="240" w:lineRule="auto"/>
+        <w:spacing w:after="40" w:line="480" w:lineRule="auto"/>
       </w:pPr>
       <w:r>
         <w:rPr>
@@ -732,7 +732,7 @@
     </w:p>
     <w:p>
       <w:pPr>
-        <w:spacing w:after="40" w:line="240" w:lineRule="auto"/>
+        <w:spacing w:after="40" w:line="480" w:lineRule="auto"/>
       </w:pPr>
       <w:r>
         <w:rPr>
@@ -756,7 +756,7 @@
     </w:p>
     <w:p>
       <w:pPr>
-        <w:spacing w:after="40" w:line="240" w:lineRule="auto"/>
+        <w:spacing w:after="40" w:line="480" w:lineRule="auto"/>
       </w:pPr>
       <w:r>
         <w:rPr>
@@ -780,7 +780,7 @@
     </w:p>
     <w:p>
       <w:pPr>
-        <w:spacing w:after="40" w:line="240" w:lineRule="auto"/>
+        <w:spacing w:after="40" w:line="480" w:lineRule="auto"/>
       </w:pPr>
       <w:r>
         <w:rPr>
@@ -804,7 +804,7 @@
     </w:p>
     <w:p>
       <w:pPr>
-        <w:spacing w:after="40" w:line="240" w:lineRule="auto"/>
+        <w:spacing w:after="40" w:line="480" w:lineRule="auto"/>
       </w:pPr>
       <w:r>
         <w:rPr>
@@ -827,15 +827,10 @@
       </w:hyperlink>
     </w:p>
     <w:p>
-      <w:r>
-        <w:br w:type="page"/>
-      </w:r>
-    </w:p>
-    <w:p>
       <w:pPr>
         <w:pStyle w:val="Heading1"/>
         <w:keepNext/>
-        <w:spacing w:before="200" w:after="80"/>
+        <w:spacing w:before="200" w:after="80" w:line="480" w:lineRule="auto"/>
       </w:pPr>
       <w:r>
         <w:rPr>
@@ -850,7 +845,7 @@
     </w:p>
     <w:p>
       <w:pPr>
-        <w:spacing w:before="0" w:after="120" w:line="269" w:lineRule="auto"/>
+        <w:spacing w:before="0" w:after="120" w:line="480" w:lineRule="auto"/>
       </w:pPr>
       <w:r>
         <w:rPr>
@@ -886,6 +881,7 @@
       <w:tr>
         <w:trPr>
           <w:tblHeader w:val="true"/>
+          <w:cantSplit/>
         </w:trPr>
         <w:tc>
           <w:tcPr>
@@ -901,7 +897,7 @@
           </w:tcPr>
           <w:p>
             <w:pPr>
-              <w:spacing w:after="0" w:line="252" w:lineRule="auto"/>
+              <w:spacing w:after="0" w:line="480" w:lineRule="auto"/>
             </w:pPr>
             <w:r/>
             <w:r>
@@ -929,7 +925,7 @@
           </w:tcPr>
           <w:p>
             <w:pPr>
-              <w:spacing w:after="0" w:line="252" w:lineRule="auto"/>
+              <w:spacing w:after="0" w:line="480" w:lineRule="auto"/>
             </w:pPr>
             <w:r/>
             <w:r>
@@ -957,7 +953,7 @@
           </w:tcPr>
           <w:p>
             <w:pPr>
-              <w:spacing w:after="0" w:line="252" w:lineRule="auto"/>
+              <w:spacing w:after="0" w:line="480" w:lineRule="auto"/>
             </w:pPr>
             <w:r/>
             <w:r>
@@ -973,6 +969,9 @@
         </w:tc>
       </w:tr>
       <w:tr>
+        <w:trPr>
+          <w:cantSplit/>
+        </w:trPr>
         <w:tc>
           <w:tcPr>
             <w:tcW w:type="dxa" w:w="1656"/>
@@ -987,7 +986,7 @@
           </w:tcPr>
           <w:p>
             <w:pPr>
-              <w:spacing w:after="0" w:line="252" w:lineRule="auto"/>
+              <w:spacing w:after="0" w:line="480" w:lineRule="auto"/>
             </w:pPr>
             <w:r/>
             <w:r>
@@ -1015,7 +1014,7 @@
           </w:tcPr>
           <w:p>
             <w:pPr>
-              <w:spacing w:after="0" w:line="252" w:lineRule="auto"/>
+              <w:spacing w:after="0" w:line="480" w:lineRule="auto"/>
             </w:pPr>
             <w:r/>
             <w:r>
@@ -1043,7 +1042,7 @@
           </w:tcPr>
           <w:p>
             <w:pPr>
-              <w:spacing w:after="0" w:line="252" w:lineRule="auto"/>
+              <w:spacing w:after="0" w:line="480" w:lineRule="auto"/>
             </w:pPr>
             <w:r/>
             <w:r>
@@ -1059,6 +1058,9 @@
         </w:tc>
       </w:tr>
       <w:tr>
+        <w:trPr>
+          <w:cantSplit/>
+        </w:trPr>
         <w:tc>
           <w:tcPr>
             <w:tcW w:type="dxa" w:w="1656"/>
@@ -1073,7 +1075,7 @@
           </w:tcPr>
           <w:p>
             <w:pPr>
-              <w:spacing w:after="0" w:line="252" w:lineRule="auto"/>
+              <w:spacing w:after="0" w:line="480" w:lineRule="auto"/>
             </w:pPr>
             <w:r/>
             <w:r>
@@ -1101,7 +1103,7 @@
           </w:tcPr>
           <w:p>
             <w:pPr>
-              <w:spacing w:after="0" w:line="252" w:lineRule="auto"/>
+              <w:spacing w:after="0" w:line="480" w:lineRule="auto"/>
             </w:pPr>
             <w:r/>
             <w:r>
@@ -1129,17 +1131,10 @@
           </w:tcPr>
           <w:p>
             <w:pPr>
-              <w:spacing w:after="0" w:line="252" w:lineRule="auto"/>
+              <w:spacing w:line="480" w:lineRule="auto"/>
             </w:pPr>
-            <w:r/>
             <w:r>
-              <w:rPr>
-                <w:rFonts w:ascii="Arial" w:hAnsi="Arial"/>
-                <w:b w:val="0"/>
-                <w:color w:val="263746"/>
-                <w:sz w:val="17"/>
-              </w:rPr>
-              <w:t>Se desinstaló porque no se necesitaba. Conviene confirmar si quedan instaladores en Descargas y volver a escanear.</w:t>
+              <w:t>Se desinstaló porque no se necesitaba. Borrar los tres instaladores de Descargas si aún están presentes y volver a escanear.</w:t>
             </w:r>
           </w:p>
         </w:tc>
@@ -1147,12 +1142,12 @@
     </w:tbl>
     <w:p>
       <w:pPr>
-        <w:spacing w:after="0"/>
+        <w:spacing w:after="0" w:line="480" w:lineRule="auto"/>
       </w:pPr>
     </w:p>
     <w:p>
       <w:pPr>
-        <w:spacing w:before="0" w:after="120" w:line="269" w:lineRule="auto"/>
+        <w:spacing w:before="0" w:after="120" w:line="480" w:lineRule="auto"/>
       </w:pPr>
       <w:r>
         <w:rPr>
@@ -1169,7 +1164,7 @@
       <w:pPr>
         <w:pStyle w:val="Heading1"/>
         <w:keepNext/>
-        <w:spacing w:before="200" w:after="80"/>
+        <w:spacing w:before="200" w:after="80" w:line="480" w:lineRule="auto"/>
       </w:pPr>
       <w:r>
         <w:rPr>
@@ -1185,7 +1180,7 @@
     <w:p>
       <w:pPr>
         <w:pStyle w:val="ListBullet"/>
-        <w:spacing w:after="60" w:line="259" w:lineRule="auto"/>
+        <w:spacing w:after="60" w:line="480" w:lineRule="auto"/>
         <w:ind w:left="288" w:hanging="187"/>
       </w:pPr>
       <w:r>
@@ -1202,7 +1197,7 @@
     <w:p>
       <w:pPr>
         <w:pStyle w:val="ListBullet"/>
-        <w:spacing w:after="60" w:line="259" w:lineRule="auto"/>
+        <w:spacing w:after="60" w:line="480" w:lineRule="auto"/>
         <w:ind w:left="288" w:hanging="187"/>
       </w:pPr>
       <w:r>
@@ -1219,7 +1214,7 @@
     <w:p>
       <w:pPr>
         <w:pStyle w:val="ListBullet"/>
-        <w:spacing w:after="60" w:line="259" w:lineRule="auto"/>
+        <w:spacing w:after="60" w:line="480" w:lineRule="auto"/>
         <w:ind w:left="288" w:hanging="187"/>
       </w:pPr>
       <w:r>
@@ -1236,7 +1231,7 @@
     <w:p>
       <w:pPr>
         <w:pStyle w:val="ListBullet"/>
-        <w:spacing w:after="60" w:line="259" w:lineRule="auto"/>
+        <w:spacing w:after="60" w:line="480" w:lineRule="auto"/>
         <w:ind w:left="288" w:hanging="187"/>
       </w:pPr>
       <w:r>
@@ -1254,400 +1249,7 @@
       <w:pPr>
         <w:pStyle w:val="Heading1"/>
         <w:keepNext/>
-        <w:spacing w:before="200" w:after="80"/>
-      </w:pPr>
-      <w:r>
-        <w:rPr>
-          <w:rFonts w:ascii="Arial" w:hAnsi="Arial"/>
-          <w:b/>
-          <w:i w:val="0"/>
-          <w:color w:val="17324D"/>
-          <w:sz w:val="28"/>
-        </w:rPr>
-        <w:t>Commits de código</w:t>
-      </w:r>
-    </w:p>
-    <w:tbl>
-      <w:tblPr>
-        <w:tblW w:type="auto" w:w="0"/>
-        <w:jc w:val="center"/>
-        <w:tblLayout w:type="fixed"/>
-        <w:tblLook w:firstColumn="1" w:firstRow="1" w:lastColumn="0" w:lastRow="0" w:noHBand="0" w:noVBand="1" w:val="04A0"/>
-        <w:tblBorders>
-          <w:top w:val="single" w:sz="5" w:space="0" w:color="D6E0E5"/>
-          <w:left w:val="single" w:sz="5" w:space="0" w:color="D6E0E5"/>
-          <w:bottom w:val="single" w:sz="5" w:space="0" w:color="D6E0E5"/>
-          <w:right w:val="single" w:sz="5" w:space="0" w:color="D6E0E5"/>
-          <w:insideH w:val="single" w:sz="5" w:space="0" w:color="D6E0E5"/>
-          <w:insideV w:val="single" w:sz="5" w:space="0" w:color="D6E0E5"/>
-        </w:tblBorders>
-      </w:tblPr>
-      <w:tblGrid>
-        <w:gridCol w:w="4997"/>
-        <w:gridCol w:w="4997"/>
-      </w:tblGrid>
-      <w:tr>
-        <w:trPr>
-          <w:tblHeader w:val="true"/>
-        </w:trPr>
-        <w:tc>
-          <w:tcPr>
-            <w:tcW w:type="dxa" w:w="1296"/>
-            <w:shd w:fill="17324D"/>
-            <w:vAlign w:val="center"/>
-            <w:tcMar>
-              <w:top w:w="90" w:type="dxa"/>
-              <w:start w:w="110" w:type="dxa"/>
-              <w:bottom w:w="90" w:type="dxa"/>
-              <w:end w:w="110" w:type="dxa"/>
-            </w:tcMar>
-          </w:tcPr>
-          <w:p>
-            <w:pPr>
-              <w:spacing w:after="0" w:line="252" w:lineRule="auto"/>
-            </w:pPr>
-            <w:r/>
-            <w:r>
-              <w:rPr>
-                <w:rFonts w:ascii="Arial" w:hAnsi="Arial"/>
-                <w:b/>
-                <w:color w:val="FFFFFF"/>
-                <w:sz w:val="18"/>
-              </w:rPr>
-              <w:t>Commit</w:t>
-            </w:r>
-          </w:p>
-        </w:tc>
-        <w:tc>
-          <w:tcPr>
-            <w:tcW w:type="dxa" w:w="8698"/>
-            <w:shd w:fill="17324D"/>
-            <w:vAlign w:val="center"/>
-            <w:tcMar>
-              <w:top w:w="90" w:type="dxa"/>
-              <w:start w:w="110" w:type="dxa"/>
-              <w:bottom w:w="90" w:type="dxa"/>
-              <w:end w:w="110" w:type="dxa"/>
-            </w:tcMar>
-          </w:tcPr>
-          <w:p>
-            <w:pPr>
-              <w:spacing w:after="0" w:line="252" w:lineRule="auto"/>
-            </w:pPr>
-            <w:r/>
-            <w:r>
-              <w:rPr>
-                <w:rFonts w:ascii="Arial" w:hAnsi="Arial"/>
-                <w:b/>
-                <w:color w:val="FFFFFF"/>
-                <w:sz w:val="18"/>
-              </w:rPr>
-              <w:t>Mensaje</w:t>
-            </w:r>
-          </w:p>
-        </w:tc>
-      </w:tr>
-      <w:tr>
-        <w:tc>
-          <w:tcPr>
-            <w:tcW w:type="dxa" w:w="1296"/>
-            <w:shd w:fill="FFFFFF"/>
-            <w:vAlign w:val="center"/>
-            <w:tcMar>
-              <w:top w:w="90" w:type="dxa"/>
-              <w:start w:w="110" w:type="dxa"/>
-              <w:bottom w:w="90" w:type="dxa"/>
-              <w:end w:w="110" w:type="dxa"/>
-            </w:tcMar>
-          </w:tcPr>
-          <w:p>
-            <w:pPr>
-              <w:spacing w:after="0" w:line="252" w:lineRule="auto"/>
-            </w:pPr>
-            <w:r/>
-            <w:r>
-              <w:rPr>
-                <w:rFonts w:ascii="Arial" w:hAnsi="Arial"/>
-                <w:b w:val="0"/>
-                <w:color w:val="263746"/>
-                <w:sz w:val="17"/>
-              </w:rPr>
-              <w:t>965a8f2</w:t>
-            </w:r>
-          </w:p>
-        </w:tc>
-        <w:tc>
-          <w:tcPr>
-            <w:tcW w:type="dxa" w:w="8698"/>
-            <w:shd w:fill="FFFFFF"/>
-            <w:vAlign w:val="center"/>
-            <w:tcMar>
-              <w:top w:w="90" w:type="dxa"/>
-              <w:start w:w="110" w:type="dxa"/>
-              <w:bottom w:w="90" w:type="dxa"/>
-              <w:end w:w="110" w:type="dxa"/>
-            </w:tcMar>
-          </w:tcPr>
-          <w:p>
-            <w:pPr>
-              <w:spacing w:after="0" w:line="252" w:lineRule="auto"/>
-            </w:pPr>
-            <w:r/>
-            <w:r>
-              <w:rPr>
-                <w:rFonts w:ascii="Arial" w:hAnsi="Arial"/>
-                <w:b w:val="0"/>
-                <w:color w:val="263746"/>
-                <w:sz w:val="17"/>
-              </w:rPr>
-              <w:t>refactor(auth): replace React Email with an HTML template</w:t>
-            </w:r>
-          </w:p>
-        </w:tc>
-      </w:tr>
-      <w:tr>
-        <w:tc>
-          <w:tcPr>
-            <w:tcW w:type="dxa" w:w="1296"/>
-            <w:shd w:fill="F5F8FA"/>
-            <w:vAlign w:val="center"/>
-            <w:tcMar>
-              <w:top w:w="90" w:type="dxa"/>
-              <w:start w:w="110" w:type="dxa"/>
-              <w:bottom w:w="90" w:type="dxa"/>
-              <w:end w:w="110" w:type="dxa"/>
-            </w:tcMar>
-          </w:tcPr>
-          <w:p>
-            <w:pPr>
-              <w:spacing w:after="0" w:line="252" w:lineRule="auto"/>
-            </w:pPr>
-            <w:r/>
-            <w:r>
-              <w:rPr>
-                <w:rFonts w:ascii="Arial" w:hAnsi="Arial"/>
-                <w:b w:val="0"/>
-                <w:color w:val="263746"/>
-                <w:sz w:val="17"/>
-              </w:rPr>
-              <w:t>1f77751</w:t>
-            </w:r>
-          </w:p>
-        </w:tc>
-        <w:tc>
-          <w:tcPr>
-            <w:tcW w:type="dxa" w:w="8698"/>
-            <w:shd w:fill="F5F8FA"/>
-            <w:vAlign w:val="center"/>
-            <w:tcMar>
-              <w:top w:w="90" w:type="dxa"/>
-              <w:start w:w="110" w:type="dxa"/>
-              <w:bottom w:w="90" w:type="dxa"/>
-              <w:end w:w="110" w:type="dxa"/>
-            </w:tcMar>
-          </w:tcPr>
-          <w:p>
-            <w:pPr>
-              <w:spacing w:after="0" w:line="252" w:lineRule="auto"/>
-            </w:pPr>
-            <w:r/>
-            <w:r>
-              <w:rPr>
-                <w:rFonts w:ascii="Arial" w:hAnsi="Arial"/>
-                <w:b w:val="0"/>
-                <w:color w:val="263746"/>
-                <w:sz w:val="17"/>
-              </w:rPr>
-              <w:t>refactor(ui): consolidate Radix imports and prune unused primitives</w:t>
-            </w:r>
-          </w:p>
-        </w:tc>
-      </w:tr>
-      <w:tr>
-        <w:tc>
-          <w:tcPr>
-            <w:tcW w:type="dxa" w:w="1296"/>
-            <w:shd w:fill="FFFFFF"/>
-            <w:vAlign w:val="center"/>
-            <w:tcMar>
-              <w:top w:w="90" w:type="dxa"/>
-              <w:start w:w="110" w:type="dxa"/>
-              <w:bottom w:w="90" w:type="dxa"/>
-              <w:end w:w="110" w:type="dxa"/>
-            </w:tcMar>
-          </w:tcPr>
-          <w:p>
-            <w:pPr>
-              <w:spacing w:after="0" w:line="252" w:lineRule="auto"/>
-            </w:pPr>
-            <w:r/>
-            <w:r>
-              <w:rPr>
-                <w:rFonts w:ascii="Arial" w:hAnsi="Arial"/>
-                <w:b w:val="0"/>
-                <w:color w:val="263746"/>
-                <w:sz w:val="17"/>
-              </w:rPr>
-              <w:t>357dbd5</w:t>
-            </w:r>
-          </w:p>
-        </w:tc>
-        <w:tc>
-          <w:tcPr>
-            <w:tcW w:type="dxa" w:w="8698"/>
-            <w:shd w:fill="FFFFFF"/>
-            <w:vAlign w:val="center"/>
-            <w:tcMar>
-              <w:top w:w="90" w:type="dxa"/>
-              <w:start w:w="110" w:type="dxa"/>
-              <w:bottom w:w="90" w:type="dxa"/>
-              <w:end w:w="110" w:type="dxa"/>
-            </w:tcMar>
-          </w:tcPr>
-          <w:p>
-            <w:pPr>
-              <w:spacing w:after="0" w:line="252" w:lineRule="auto"/>
-            </w:pPr>
-            <w:r/>
-            <w:r>
-              <w:rPr>
-                <w:rFonts w:ascii="Arial" w:hAnsi="Arial"/>
-                <w:b w:val="0"/>
-                <w:color w:val="263746"/>
-                <w:sz w:val="17"/>
-              </w:rPr>
-              <w:t>chore(deps): update packages and remove unused dependencies</w:t>
-            </w:r>
-          </w:p>
-        </w:tc>
-      </w:tr>
-      <w:tr>
-        <w:tc>
-          <w:tcPr>
-            <w:tcW w:type="dxa" w:w="1296"/>
-            <w:shd w:fill="F5F8FA"/>
-            <w:vAlign w:val="center"/>
-            <w:tcMar>
-              <w:top w:w="90" w:type="dxa"/>
-              <w:start w:w="110" w:type="dxa"/>
-              <w:bottom w:w="90" w:type="dxa"/>
-              <w:end w:w="110" w:type="dxa"/>
-            </w:tcMar>
-          </w:tcPr>
-          <w:p>
-            <w:pPr>
-              <w:spacing w:after="0" w:line="252" w:lineRule="auto"/>
-            </w:pPr>
-            <w:r/>
-            <w:r>
-              <w:rPr>
-                <w:rFonts w:ascii="Arial" w:hAnsi="Arial"/>
-                <w:b w:val="0"/>
-                <w:color w:val="263746"/>
-                <w:sz w:val="17"/>
-              </w:rPr>
-              <w:t>9a00b69</w:t>
-            </w:r>
-          </w:p>
-        </w:tc>
-        <w:tc>
-          <w:tcPr>
-            <w:tcW w:type="dxa" w:w="8698"/>
-            <w:shd w:fill="F5F8FA"/>
-            <w:vAlign w:val="center"/>
-            <w:tcMar>
-              <w:top w:w="90" w:type="dxa"/>
-              <w:start w:w="110" w:type="dxa"/>
-              <w:bottom w:w="90" w:type="dxa"/>
-              <w:end w:w="110" w:type="dxa"/>
-            </w:tcMar>
-          </w:tcPr>
-          <w:p>
-            <w:pPr>
-              <w:spacing w:after="0" w:line="252" w:lineRule="auto"/>
-            </w:pPr>
-            <w:r/>
-            <w:r>
-              <w:rPr>
-                <w:rFonts w:ascii="Arial" w:hAnsi="Arial"/>
-                <w:b w:val="0"/>
-                <w:color w:val="263746"/>
-                <w:sz w:val="17"/>
-              </w:rPr>
-              <w:t>fix(auth): validate password reset email input</w:t>
-            </w:r>
-          </w:p>
-        </w:tc>
-      </w:tr>
-      <w:tr>
-        <w:tc>
-          <w:tcPr>
-            <w:tcW w:type="dxa" w:w="1296"/>
-            <w:shd w:fill="FFFFFF"/>
-            <w:vAlign w:val="center"/>
-            <w:tcMar>
-              <w:top w:w="90" w:type="dxa"/>
-              <w:start w:w="110" w:type="dxa"/>
-              <w:bottom w:w="90" w:type="dxa"/>
-              <w:end w:w="110" w:type="dxa"/>
-            </w:tcMar>
-          </w:tcPr>
-          <w:p>
-            <w:pPr>
-              <w:spacing w:after="0" w:line="252" w:lineRule="auto"/>
-            </w:pPr>
-            <w:r/>
-            <w:r>
-              <w:rPr>
-                <w:rFonts w:ascii="Arial" w:hAnsi="Arial"/>
-                <w:b w:val="0"/>
-                <w:color w:val="263746"/>
-                <w:sz w:val="17"/>
-              </w:rPr>
-              <w:t>ac9b45a</w:t>
-            </w:r>
-          </w:p>
-        </w:tc>
-        <w:tc>
-          <w:tcPr>
-            <w:tcW w:type="dxa" w:w="8698"/>
-            <w:shd w:fill="FFFFFF"/>
-            <w:vAlign w:val="center"/>
-            <w:tcMar>
-              <w:top w:w="90" w:type="dxa"/>
-              <w:start w:w="110" w:type="dxa"/>
-              <w:bottom w:w="90" w:type="dxa"/>
-              <w:end w:w="110" w:type="dxa"/>
-            </w:tcMar>
-          </w:tcPr>
-          <w:p>
-            <w:pPr>
-              <w:spacing w:after="0" w:line="252" w:lineRule="auto"/>
-            </w:pPr>
-            <w:r/>
-            <w:r>
-              <w:rPr>
-                <w:rFonts w:ascii="Arial" w:hAnsi="Arial"/>
-                <w:b w:val="0"/>
-                <w:color w:val="263746"/>
-                <w:sz w:val="17"/>
-              </w:rPr>
-              <w:t>fix(deps): resolve dependency audit findings</w:t>
-            </w:r>
-          </w:p>
-        </w:tc>
-      </w:tr>
-    </w:tbl>
-    <w:p>
-      <w:pPr>
-        <w:spacing w:after="0"/>
-      </w:pPr>
-    </w:p>
-    <w:p>
-      <w:pPr>
-        <w:pStyle w:val="Heading1"/>
-        <w:keepNext/>
-        <w:spacing w:before="200" w:after="80"/>
+        <w:spacing w:before="200" w:after="80" w:line="480" w:lineRule="auto"/>
       </w:pPr>
       <w:r>
         <w:rPr>
@@ -1663,7 +1265,7 @@
     <w:p>
       <w:pPr>
         <w:pStyle w:val="ListBullet"/>
-        <w:spacing w:after="60" w:line="259" w:lineRule="auto"/>
+        <w:spacing w:after="60" w:line="480" w:lineRule="auto"/>
         <w:ind w:left="288" w:hanging="187"/>
       </w:pPr>
       <w:r>
@@ -1680,7 +1282,7 @@
     <w:p>
       <w:pPr>
         <w:pStyle w:val="ListBullet"/>
-        <w:spacing w:after="60" w:line="259" w:lineRule="auto"/>
+        <w:spacing w:after="60" w:line="480" w:lineRule="auto"/>
         <w:ind w:left="288" w:hanging="187"/>
       </w:pPr>
       <w:r>
@@ -1697,7 +1299,7 @@
     <w:p>
       <w:pPr>
         <w:pStyle w:val="ListBullet"/>
-        <w:spacing w:after="60" w:line="259" w:lineRule="auto"/>
+        <w:spacing w:after="60" w:line="480" w:lineRule="auto"/>
         <w:ind w:left="288" w:hanging="187"/>
       </w:pPr>
       <w:r>
@@ -1714,7 +1316,7 @@
     <w:p>
       <w:pPr>
         <w:pStyle w:val="ListBullet"/>
-        <w:spacing w:after="60" w:line="259" w:lineRule="auto"/>
+        <w:spacing w:after="60" w:line="480" w:lineRule="auto"/>
         <w:ind w:left="288" w:hanging="187"/>
       </w:pPr>
       <w:r>
@@ -1730,6 +1332,11 @@
     </w:p>
     <w:sectPr>
       <w:footerReference w:type="default" r:id="rId9"/>
+      <w:headerReference w:type="default" r:id="rId14"/>
+      <w:headerReference w:type="first" r:id="rId15"/>
+      <w:footerReference w:type="first" r:id="rId16"/>
+      <w:headerReference w:type="even" r:id="rId17"/>
+      <w:footerReference w:type="even" r:id="rId18"/>
       <w:pgSz w:w="12240" w:h="15840"/>
       <w:pgMar w:top="979" w:right="1123" w:bottom="936" w:left="1123" w:header="720" w:footer="432" w:gutter="0"/>
       <w:cols w:space="720"/>
@@ -1744,7 +1351,7 @@
   <w:p>
     <w:pPr>
       <w:pStyle w:val="Footer"/>
-      <w:spacing w:before="0" w:after="0"/>
+      <w:spacing w:before="0" w:after="0" w:line="480" w:lineRule="auto"/>
       <w:jc w:val="right"/>
     </w:pPr>
     <w:r>
@@ -1759,6 +1366,61 @@
     </w:r>
   </w:p>
 </w:ftr>
+</file>
+
+<file path=word/footer2.xml><?xml version="1.0" encoding="utf-8"?>
+<w:ftr xmlns:m="http://schemas.openxmlformats.org/officeDocument/2006/math" xmlns:mc="http://schemas.openxmlformats.org/markup-compatibility/2006" xmlns:mo="http://schemas.microsoft.com/office/mac/office/2008/main" xmlns:mv="urn:schemas-microsoft-com:mac:vml" xmlns:o="urn:schemas-microsoft-com:office:office" xmlns:r="http://schemas.openxmlformats.org/officeDocument/2006/relationships" xmlns:v="urn:schemas-microsoft-com:vml" xmlns:w10="urn:schemas-microsoft-com:office:word" xmlns:w14="http://schemas.microsoft.com/office/word/2010/wordml" xmlns:w="http://schemas.openxmlformats.org/wordprocessingml/2006/main" xmlns:wne="http://schemas.microsoft.com/office/word/2006/wordml" xmlns:wp14="http://schemas.microsoft.com/office/word/2010/wordprocessingDrawing" xmlns:wp="http://schemas.openxmlformats.org/drawingml/2006/wordprocessingDrawing" xmlns:wpc="http://schemas.microsoft.com/office/word/2010/wordprocessingCanvas" xmlns:wpg="http://schemas.microsoft.com/office/word/2010/wordprocessingGroup" xmlns:wpi="http://schemas.microsoft.com/office/word/2010/wordprocessingInk" xmlns:wps="http://schemas.microsoft.com/office/word/2010/wordprocessingShape" mc:Ignorable="w14 wp14">
+  <w:p>
+    <w:pPr>
+      <w:pStyle w:val="Footer"/>
+      <w:spacing w:line="480" w:lineRule="auto"/>
+    </w:pPr>
+  </w:p>
+</w:ftr>
+</file>
+
+<file path=word/footer3.xml><?xml version="1.0" encoding="utf-8"?>
+<w:ftr xmlns:m="http://schemas.openxmlformats.org/officeDocument/2006/math" xmlns:mc="http://schemas.openxmlformats.org/markup-compatibility/2006" xmlns:mo="http://schemas.microsoft.com/office/mac/office/2008/main" xmlns:mv="urn:schemas-microsoft-com:mac:vml" xmlns:o="urn:schemas-microsoft-com:office:office" xmlns:r="http://schemas.openxmlformats.org/officeDocument/2006/relationships" xmlns:v="urn:schemas-microsoft-com:vml" xmlns:w10="urn:schemas-microsoft-com:office:word" xmlns:w14="http://schemas.microsoft.com/office/word/2010/wordml" xmlns:w="http://schemas.openxmlformats.org/wordprocessingml/2006/main" xmlns:wne="http://schemas.microsoft.com/office/word/2006/wordml" xmlns:wp14="http://schemas.microsoft.com/office/word/2010/wordprocessingDrawing" xmlns:wp="http://schemas.openxmlformats.org/drawingml/2006/wordprocessingDrawing" xmlns:wpc="http://schemas.microsoft.com/office/word/2010/wordprocessingCanvas" xmlns:wpg="http://schemas.microsoft.com/office/word/2010/wordprocessingGroup" xmlns:wpi="http://schemas.microsoft.com/office/word/2010/wordprocessingInk" xmlns:wps="http://schemas.microsoft.com/office/word/2010/wordprocessingShape" mc:Ignorable="w14 wp14">
+  <w:p>
+    <w:pPr>
+      <w:pStyle w:val="Footer"/>
+      <w:spacing w:line="480" w:lineRule="auto"/>
+    </w:pPr>
+  </w:p>
+</w:ftr>
+</file>
+
+<file path=word/header1.xml><?xml version="1.0" encoding="utf-8"?>
+<w:hdr xmlns:m="http://schemas.openxmlformats.org/officeDocument/2006/math" xmlns:mc="http://schemas.openxmlformats.org/markup-compatibility/2006" xmlns:mo="http://schemas.microsoft.com/office/mac/office/2008/main" xmlns:mv="urn:schemas-microsoft-com:mac:vml" xmlns:o="urn:schemas-microsoft-com:office:office" xmlns:r="http://schemas.openxmlformats.org/officeDocument/2006/relationships" xmlns:v="urn:schemas-microsoft-com:vml" xmlns:w10="urn:schemas-microsoft-com:office:word" xmlns:w14="http://schemas.microsoft.com/office/word/2010/wordml" xmlns:w="http://schemas.openxmlformats.org/wordprocessingml/2006/main" xmlns:wne="http://schemas.microsoft.com/office/word/2006/wordml" xmlns:wp14="http://schemas.microsoft.com/office/word/2010/wordprocessingDrawing" xmlns:wp="http://schemas.openxmlformats.org/drawingml/2006/wordprocessingDrawing" xmlns:wpc="http://schemas.microsoft.com/office/word/2010/wordprocessingCanvas" xmlns:wpg="http://schemas.microsoft.com/office/word/2010/wordprocessingGroup" xmlns:wpi="http://schemas.microsoft.com/office/word/2010/wordprocessingInk" xmlns:wps="http://schemas.microsoft.com/office/word/2010/wordprocessingShape" mc:Ignorable="w14 wp14">
+  <w:p>
+    <w:pPr>
+      <w:pStyle w:val="Header"/>
+      <w:spacing w:line="480" w:lineRule="auto"/>
+    </w:pPr>
+  </w:p>
+</w:hdr>
+</file>
+
+<file path=word/header2.xml><?xml version="1.0" encoding="utf-8"?>
+<w:hdr xmlns:m="http://schemas.openxmlformats.org/officeDocument/2006/math" xmlns:mc="http://schemas.openxmlformats.org/markup-compatibility/2006" xmlns:mo="http://schemas.microsoft.com/office/mac/office/2008/main" xmlns:mv="urn:schemas-microsoft-com:mac:vml" xmlns:o="urn:schemas-microsoft-com:office:office" xmlns:r="http://schemas.openxmlformats.org/officeDocument/2006/relationships" xmlns:v="urn:schemas-microsoft-com:vml" xmlns:w10="urn:schemas-microsoft-com:office:word" xmlns:w14="http://schemas.microsoft.com/office/word/2010/wordml" xmlns:w="http://schemas.openxmlformats.org/wordprocessingml/2006/main" xmlns:wne="http://schemas.microsoft.com/office/word/2006/wordml" xmlns:wp14="http://schemas.microsoft.com/office/word/2010/wordprocessingDrawing" xmlns:wp="http://schemas.openxmlformats.org/drawingml/2006/wordprocessingDrawing" xmlns:wpc="http://schemas.microsoft.com/office/word/2010/wordprocessingCanvas" xmlns:wpg="http://schemas.microsoft.com/office/word/2010/wordprocessingGroup" xmlns:wpi="http://schemas.microsoft.com/office/word/2010/wordprocessingInk" xmlns:wps="http://schemas.microsoft.com/office/word/2010/wordprocessingShape" mc:Ignorable="w14 wp14">
+  <w:p>
+    <w:pPr>
+      <w:pStyle w:val="Header"/>
+      <w:spacing w:line="480" w:lineRule="auto"/>
+    </w:pPr>
+  </w:p>
+</w:hdr>
+</file>
+
+<file path=word/header3.xml><?xml version="1.0" encoding="utf-8"?>
+<w:hdr xmlns:m="http://schemas.openxmlformats.org/officeDocument/2006/math" xmlns:mc="http://schemas.openxmlformats.org/markup-compatibility/2006" xmlns:mo="http://schemas.microsoft.com/office/mac/office/2008/main" xmlns:mv="urn:schemas-microsoft-com:mac:vml" xmlns:o="urn:schemas-microsoft-com:office:office" xmlns:r="http://schemas.openxmlformats.org/officeDocument/2006/relationships" xmlns:v="urn:schemas-microsoft-com:vml" xmlns:w10="urn:schemas-microsoft-com:office:word" xmlns:w14="http://schemas.microsoft.com/office/word/2010/wordml" xmlns:w="http://schemas.openxmlformats.org/wordprocessingml/2006/main" xmlns:wne="http://schemas.microsoft.com/office/word/2006/wordml" xmlns:wp14="http://schemas.microsoft.com/office/word/2010/wordprocessingDrawing" xmlns:wp="http://schemas.openxmlformats.org/drawingml/2006/wordprocessingDrawing" xmlns:wpc="http://schemas.microsoft.com/office/word/2010/wordprocessingCanvas" xmlns:wpg="http://schemas.microsoft.com/office/word/2010/wordprocessingGroup" xmlns:wpi="http://schemas.microsoft.com/office/word/2010/wordprocessingInk" xmlns:wps="http://schemas.microsoft.com/office/word/2010/wordprocessingShape" mc:Ignorable="w14 wp14">
+  <w:p>
+    <w:pPr>
+      <w:pStyle w:val="Header"/>
+      <w:spacing w:line="480" w:lineRule="auto"/>
+    </w:pPr>
+  </w:p>
+</w:hdr>
 </file>
 
 <file path=word/numbering.xml><?xml version="1.0" encoding="utf-8"?>

</xml_diff>

<commit_message>
docs: update server cleanup status
</commit_message>
<xml_diff>
--- a/docs/reports/informe-seguridad-dependencias-metra-2026-10-08.docx
+++ b/docs/reports/informe-seguridad-dependencias-metra-2026-10-08.docx
@@ -1042,17 +1042,10 @@
           </w:tcPr>
           <w:p>
             <w:pPr>
-              <w:spacing w:after="0" w:line="480" w:lineRule="auto"/>
+              <w:spacing w:line="480" w:lineRule="auto"/>
             </w:pPr>
-            <w:r/>
             <w:r>
-              <w:rPr>
-                <w:rFonts w:ascii="Arial" w:hAnsi="Arial"/>
-                <w:b w:val="0"/>
-                <w:color w:val="263746"/>
-                <w:sz w:val="17"/>
-              </w:rPr>
-              <w:t>Se desinstaló porque no se necesitaba. Falta confirmar la eliminación con un nuevo escaneo.</w:t>
+              <w:t>Se desinstaló porque no se necesitaba.</w:t>
             </w:r>
           </w:p>
         </w:tc>
@@ -1134,7 +1127,7 @@
               <w:spacing w:line="480" w:lineRule="auto"/>
             </w:pPr>
             <w:r>
-              <w:t>Se desinstaló porque no se necesitaba. Borrar los tres instaladores de Descargas si aún están presentes y volver a escanear.</w:t>
+              <w:t>Se desinstaló porque no se necesitaba. También se eliminaron los tres instaladores EXE de Descargas.</w:t>
             </w:r>
           </w:p>
         </w:tc>
@@ -1150,14 +1143,7 @@
         <w:spacing w:before="0" w:after="120" w:line="480" w:lineRule="auto"/>
       </w:pPr>
       <w:r>
-        <w:rPr>
-          <w:rFonts w:ascii="Arial" w:hAnsi="Arial"/>
-          <w:b w:val="0"/>
-          <w:i w:val="0"/>
-          <w:color w:val="263746"/>
-          <w:sz w:val="20"/>
-        </w:rPr>
-        <w:t>La desinstalación de estos programas sí se relaciona con el inventario del servidor porque el escáner detectó archivos y componentes dentro de ambos. No son dependencias de package.json: su retiro reduce el software presente en el host, pero no corrige por sí solo las dependencias de Node.js. El PDF es una fotografía anterior a la desinstalación; no se verificó directamente el servidor desde este repositorio.</w:t>
+        <w:t>La desinstalación de Docker Desktop y Visual Studio Code y la eliminación de los instaladores corresponden al software y los archivos del servidor. Estas acciones no modifican las dependencias de package.json ni el árbol de paquetes Node.js.</w:t>
       </w:r>
     </w:p>
     <w:p>
@@ -1252,14 +1238,7 @@
         <w:spacing w:before="200" w:after="80" w:line="480" w:lineRule="auto"/>
       </w:pPr>
       <w:r>
-        <w:rPr>
-          <w:rFonts w:ascii="Arial" w:hAnsi="Arial"/>
-          <w:b/>
-          <w:i w:val="0"/>
-          <w:color w:val="17324D"/>
-          <w:sz w:val="28"/>
-        </w:rPr>
-        <w:t>Verificación y seguimiento</w:t>
+        <w:t>Verificación</w:t>
       </w:r>
     </w:p>
     <w:p>
@@ -1294,40 +1273,6 @@
           <w:sz w:val="19"/>
         </w:rPr>
         <w:t>pnpm install y la generación de Prisma Client 7.10.0 terminaron correctamente.</w:t>
-      </w:r>
-    </w:p>
-    <w:p>
-      <w:pPr>
-        <w:pStyle w:val="ListBullet"/>
-        <w:spacing w:after="60" w:line="480" w:lineRule="auto"/>
-        <w:ind w:left="288" w:hanging="187"/>
-      </w:pPr>
-      <w:r>
-        <w:rPr>
-          <w:rFonts w:ascii="Arial" w:hAnsi="Arial"/>
-          <w:b w:val="0"/>
-          <w:i w:val="0"/>
-          <w:color w:val="263746"/>
-          <w:sz w:val="19"/>
-        </w:rPr>
-        <w:t>pnpm typecheck no termina limpio: quedan cuatro errores de TypeScript en imports PNG/JPG de tres imágenes. Los errores están en assets y no en los archivos modificados.</w:t>
-      </w:r>
-    </w:p>
-    <w:p>
-      <w:pPr>
-        <w:pStyle w:val="ListBullet"/>
-        <w:spacing w:after="60" w:line="480" w:lineRule="auto"/>
-        <w:ind w:left="288" w:hanging="187"/>
-      </w:pPr>
-      <w:r>
-        <w:rPr>
-          <w:rFonts w:ascii="Arial" w:hAnsi="Arial"/>
-          <w:b w:val="0"/>
-          <w:i w:val="0"/>
-          <w:color w:val="263746"/>
-          <w:sz w:val="19"/>
-        </w:rPr>
-        <w:t>No se ejecutaron pruebas automatizadas ni build. El nuevo escaneo del servidor sigue pendiente para confirmar la desinstalación y revisar instaladores remanentes.</w:t>
       </w:r>
     </w:p>
     <w:sectPr>

</xml_diff>